<commit_message>
Etapa 3: documenta o filtro de vizinhos fracos (MIN_CF) do site na seção 3.9
Co-Authored-By: Claude Opus 5.5 <noreply@anthropic.com>
Claude-Session: https://claude.ai/code/session_01QrcUeDLeuAFcz2wWVBme1X
</commit_message>
<xml_diff>
--- a/etapa-3-metodologia/Projeto_Aplicado_III_Etapa3.docx
+++ b/etapa-3-metodologia/Projeto_Aplicado_III_Etapa3.docx
@@ -6421,6 +6421,15 @@
       </w:pPr>
       <w:r>
         <w:t xml:space="preserve">Para cumprir o objetivo extensionista, o modelo foi disponibilizado no site Próximo Curso (https://brunocerqueiragianotti.github.io/proximo-curso/), publicado gratuitamente pelo GitHub Pages. O site faz até cinco perguntas simples (o que a pessoa quer aprender ou quais áreas a interessam, seu momento de carreira, seu nível e o idioma preferido) e permite marcar cursos já feitos. Os dados do modelo são calculados em Python, com todas as avaliações limpas e a configuração escolhida na validação, e incorporados à página; o híbrido é executado no próprio navegador, sem servidor. Cada sugestão mostra o motivo da indicação, e a pessoa pode pedir mais cursos parecidos ou descartar uma sugestão, o que atualiza a lista na hora. A página inicial apresenta as 12 áreas cobertas pelo catálogo e quantos cursos há em cada uma, já que a base tem mais cursos em algumas áreas do que em outras.</w:t>
+      </w:r>
+    </w:p>
+    <w:p>
+      <w:pPr>
+        <w:spacing w:after="200"/>
+        <w:jc w:val="both"/>
+      </w:pPr>
+      <w:r>
+        <w:t xml:space="preserve">No site foi acrescentada uma regra de qualidade que não faz parte da avaliação offline: vizinhos colaborativos com similaridade menor que 0,05 são desconsiderados. Esses vizinhos aparecem em cursos com poucas avaliações e surgem de apenas uma ou duas pessoas em comum; depois da normalização min-max, uma ligação tão fraca podia virar a pontuação máxima e gerar recomendações sem relação com o curso marcado. Na validação, a regra reduziu ligeiramente o NDCG@10 (de 0,1999 para 0,1952), custo considerado aceitável em troca de recomendações mais coerentes para quem usa o site.</w:t>
       </w:r>
     </w:p>
     <w:p>

</xml_diff>

<commit_message>
Etapa 3: links clicáveis no documento (GitHub, site, Kaggle e DOIs)
Co-Authored-By: Claude Opus 5.5 <noreply@anthropic.com>
Claude-Session: https://claude.ai/code/session_01QrcUeDLeuAFcz2wWVBme1X
</commit_message>
<xml_diff>
--- a/etapa-3-metodologia/Projeto_Aplicado_III_Etapa3.docx
+++ b/etapa-3-metodologia/Projeto_Aplicado_III_Etapa3.docx
@@ -3944,7 +3944,23 @@
         <w:rPr>
           <w:rtl w:val="0"/>
         </w:rPr>
-        <w:t xml:space="preserve">Nesta seção é apresentado o desenvolvimento do trabalho, descrevendo a metodologia utilizada para a execução dos experimentos e para a disponibilização do sistema. O esquema geral da metodologia é apresentado na Figura 1, e as próximas subseções detalham cada etapa. Todo o código foi desenvolvido em Python, em notebook do Google Colab, e está disponível, junto com o site e os dados de configuração, no repositório público do projeto no GitHub: https://github.com/BrunoCerqueiraGianotti/proximo-curso.</w:t>
+        <w:t xml:space="preserve">Nesta seção é apresentado o desenvolvimento do trabalho, descrevendo a metodologia utilizada para a execução dos experimentos e para a disponibilização do sistema. O esquema geral da metodologia é apresentado na Figura 1, e as próximas subseções detalham cada etapa. Todo o código foi desenvolvido em Python, em notebook do Google Colab, e está disponível, junto com o site e os dados de configuração, no repositório público do projeto no GitHub: </w:t>
+      </w:r>
+      <w:hyperlink r:id="rIdLink1">
+        <w:r>
+          <w:rPr>
+            <w:color w:val="1155cc"/>
+            <w:u w:val="single"/>
+            <w:rtl w:val="0"/>
+          </w:rPr>
+          <w:t xml:space="preserve">https://github.com/BrunoCerqueiraGianotti/proximo-curso</w:t>
+        </w:r>
+      </w:hyperlink>
+      <w:r>
+        <w:rPr>
+          <w:rtl w:val="0"/>
+        </w:rPr>
+        <w:t xml:space="preserve">.</w:t>
       </w:r>
     </w:p>
     <w:p>
@@ -7964,7 +7980,23 @@
         <w:rPr>
           <w:rtl w:val="0"/>
         </w:rPr>
-        <w:t xml:space="preserve">Para cumprir o objetivo extensionista, o modelo foi disponibilizado no site Próximo Curso (https://brunocerqueiragianotti.github.io/proximo-curso/), publicado gratuitamente pelo GitHub Pages. O site faz até cinco perguntas simples (o que a pessoa quer aprender ou quais áreas a interessam, seu momento de carreira, seu nível e o idioma preferido) e permite marcar cursos já feitos. Os dados do modelo são calculados em Python, com todas as avaliações limpas e a configuração escolhida na validação, e incorporados à página; o híbrido é executado no próprio navegador, sem servidor. Cada sugestão mostra o motivo da indicação, e a pessoa pode pedir mais cursos parecidos ou descartar uma sugestão, o que atualiza a lista na hora. A página inicial apresenta as 12 áreas cobertas pelo catálogo e quantos cursos há em cada uma, já que a base tem mais cursos em algumas áreas do que em outras.</w:t>
+        <w:t xml:space="preserve">Para cumprir o objetivo extensionista, o modelo foi disponibilizado no site Próximo Curso (</w:t>
+      </w:r>
+      <w:hyperlink r:id="rIdLink2">
+        <w:r>
+          <w:rPr>
+            <w:color w:val="1155cc"/>
+            <w:u w:val="single"/>
+            <w:rtl w:val="0"/>
+          </w:rPr>
+          <w:t xml:space="preserve">https://brunocerqueiragianotti.github.io/proximo-curso/</w:t>
+        </w:r>
+      </w:hyperlink>
+      <w:r>
+        <w:rPr>
+          <w:rtl w:val="0"/>
+        </w:rPr>
+        <w:t xml:space="preserve">), publicado gratuitamente pelo GitHub Pages. O site faz até cinco perguntas simples (o que a pessoa quer aprender ou quais áreas a interessam, seu momento de carreira, seu nível e o idioma preferido) e permite marcar cursos já feitos. Os dados do modelo são calculados em Python, com todas as avaliações limpas e a configuração escolhida na validação, e incorporados à página; o híbrido é executado no próprio navegador, sem servidor. Cada sugestão mostra o motivo da indicação, e a pessoa pode pedir mais cursos parecidos ou descartar uma sugestão, o que atualiza a lista na hora. A página inicial apresenta as 12 áreas cobertas pelo catálogo e quantos cursos há em cada uma, já que a base tem mais cursos em algumas áreas do que em outras.</w:t>
       </w:r>
     </w:p>
     <w:p>
@@ -8016,7 +8048,23 @@
         <w:rPr>
           <w:rtl w:val="0"/>
         </w:rPr>
-        <w:t xml:space="preserve">O repositório do projeto (https://github.com/BrunoCerqueiraGianotti/proximo-curso) reúne, organizados por etapa, os documentos entregues, os notebooks, os scripts de preparação dos dados do site, o código do site e do painel, o script de coleta e as instruções para reproduzir todo o trabalho.</w:t>
+        <w:t xml:space="preserve">O repositório do projeto (</w:t>
+      </w:r>
+      <w:hyperlink r:id="rIdLink3">
+        <w:r>
+          <w:rPr>
+            <w:color w:val="1155cc"/>
+            <w:u w:val="single"/>
+            <w:rtl w:val="0"/>
+          </w:rPr>
+          <w:t xml:space="preserve">https://github.com/BrunoCerqueiraGianotti/proximo-curso</w:t>
+        </w:r>
+      </w:hyperlink>
+      <w:r>
+        <w:rPr>
+          <w:rtl w:val="0"/>
+        </w:rPr>
+        <w:t xml:space="preserve">) reúne, organizados por etapa, os documentos entregues, os notebooks, os scripts de preparação dos dados do site, o código do site e do painel, o script de coleta e as instruções para reproduzir todo o trabalho.</w:t>
       </w:r>
     </w:p>
     <w:p>
@@ -8153,7 +8201,23 @@
         <w:rPr>
           <w:rtl w:val="0"/>
         </w:rPr>
-        <w:t xml:space="preserve"> emphasis on cold start problem. Frontiers in Computer Science, v. 6, art. 1404391, 2024. DOI: https://doi.org/10.3389/fcomp.2024.1404391.</w:t>
+        <w:t xml:space="preserve"> emphasis on cold start problem. Frontiers in Computer Science, v. 6, art. 1404391, 2024. DOI: </w:t>
+      </w:r>
+      <w:hyperlink r:id="rIdLink4">
+        <w:r>
+          <w:rPr>
+            <w:color w:val="1155cc"/>
+            <w:u w:val="single"/>
+            <w:rtl w:val="0"/>
+          </w:rPr>
+          <w:t xml:space="preserve">https://doi.org/10.3389/fcomp.2024.1404391</w:t>
+        </w:r>
+      </w:hyperlink>
+      <w:r>
+        <w:rPr>
+          <w:rtl w:val="0"/>
+        </w:rPr>
+        <w:t xml:space="preserve">.</w:t>
       </w:r>
     </w:p>
     <w:p>
@@ -8180,7 +8244,23 @@
         <w:rPr>
           <w:rtl w:val="0"/>
         </w:rPr>
-        <w:t xml:space="preserve">, v. 39, n. 2, p. 1-49, 2021. DOI: https://doi.org/10.1145/3434185.</w:t>
+        <w:t xml:space="preserve">, v. 39, n. 2, p. 1-49, 2021. DOI: </w:t>
+      </w:r>
+      <w:hyperlink r:id="rIdLink5">
+        <w:r>
+          <w:rPr>
+            <w:color w:val="1155cc"/>
+            <w:u w:val="single"/>
+            <w:rtl w:val="0"/>
+          </w:rPr>
+          <w:t xml:space="preserve">https://doi.org/10.1145/3434185</w:t>
+        </w:r>
+      </w:hyperlink>
+      <w:r>
+        <w:rPr>
+          <w:rtl w:val="0"/>
+        </w:rPr>
+        <w:t xml:space="preserve">.</w:t>
       </w:r>
     </w:p>
     <w:p>
@@ -8207,7 +8287,23 @@
         <w:rPr>
           <w:rtl w:val="0"/>
         </w:rPr>
-        <w:t xml:space="preserve">, v. 20, n. 4, p. 422-446, 2002. DOI: https://doi.org/10.1145/582415.582418.</w:t>
+        <w:t xml:space="preserve">, v. 20, n. 4, p. 422-446, 2002. DOI: </w:t>
+      </w:r>
+      <w:hyperlink r:id="rIdLink6">
+        <w:r>
+          <w:rPr>
+            <w:color w:val="1155cc"/>
+            <w:u w:val="single"/>
+            <w:rtl w:val="0"/>
+          </w:rPr>
+          <w:t xml:space="preserve">https://doi.org/10.1145/582415.582418</w:t>
+        </w:r>
+      </w:hyperlink>
+      <w:r>
+        <w:rPr>
+          <w:rtl w:val="0"/>
+        </w:rPr>
+        <w:t xml:space="preserve">.</w:t>
       </w:r>
     </w:p>
     <w:p>
@@ -8234,7 +8330,23 @@
         <w:rPr>
           <w:rtl w:val="0"/>
         </w:rPr>
-        <w:t xml:space="preserve">, v. 41, n. 3, p. 1-27, 2023. DOI: https://doi.org/10.1145/3569930.</w:t>
+        <w:t xml:space="preserve">, v. 41, n. 3, p. 1-27, 2023. DOI: </w:t>
+      </w:r>
+      <w:hyperlink r:id="rIdLink7">
+        <w:r>
+          <w:rPr>
+            <w:color w:val="1155cc"/>
+            <w:u w:val="single"/>
+            <w:rtl w:val="0"/>
+          </w:rPr>
+          <w:t xml:space="preserve">https://doi.org/10.1145/3569930</w:t>
+        </w:r>
+      </w:hyperlink>
+      <w:r>
+        <w:rPr>
+          <w:rtl w:val="0"/>
+        </w:rPr>
+        <w:t xml:space="preserve">.</w:t>
       </w:r>
     </w:p>
     <w:p>
@@ -8261,7 +8373,23 @@
         <w:rPr>
           <w:rtl w:val="0"/>
         </w:rPr>
-        <w:t xml:space="preserve">, v. 34, n. 7, p. 577-590, 2018. DOI: https://doi.org/10.1080/10447318.2018.1455307.</w:t>
+        <w:t xml:space="preserve">, v. 34, n. 7, p. 577-590, 2018. DOI: </w:t>
+      </w:r>
+      <w:hyperlink r:id="rIdLink8">
+        <w:r>
+          <w:rPr>
+            <w:color w:val="1155cc"/>
+            <w:u w:val="single"/>
+            <w:rtl w:val="0"/>
+          </w:rPr>
+          <w:t xml:space="preserve">https://doi.org/10.1080/10447318.2018.1455307</w:t>
+        </w:r>
+      </w:hyperlink>
+      <w:r>
+        <w:rPr>
+          <w:rtl w:val="0"/>
+        </w:rPr>
+        <w:t xml:space="preserve">.</w:t>
       </w:r>
     </w:p>
     <w:p>
@@ -8288,7 +8416,23 @@
         <w:rPr>
           <w:rtl w:val="0"/>
         </w:rPr>
-        <w:t xml:space="preserve">. Boston: Springer, 2011. p. 73-105. DOI: https://doi.org/10.1007/978-0-387-85820-3_3.</w:t>
+        <w:t xml:space="preserve">. Boston: Springer, 2011. p. 73-105. DOI: </w:t>
+      </w:r>
+      <w:hyperlink r:id="rIdLink9">
+        <w:r>
+          <w:rPr>
+            <w:color w:val="1155cc"/>
+            <w:u w:val="single"/>
+            <w:rtl w:val="0"/>
+          </w:rPr>
+          <w:t xml:space="preserve">https://doi.org/10.1007/978-0-387-85820-3_3</w:t>
+        </w:r>
+      </w:hyperlink>
+      <w:r>
+        <w:rPr>
+          <w:rtl w:val="0"/>
+        </w:rPr>
+        <w:t xml:space="preserve">.</w:t>
       </w:r>
     </w:p>
     <w:p>
@@ -8315,7 +8459,23 @@
         <w:rPr>
           <w:rtl w:val="0"/>
         </w:rPr>
-        <w:t xml:space="preserve">, v. 18, n. 2, p. 231-240, 2024. DOI: https://doi.org/10.37652/juaps.2024.146489.1187.</w:t>
+        <w:t xml:space="preserve">, v. 18, n. 2, p. 231-240, 2024. DOI: </w:t>
+      </w:r>
+      <w:hyperlink r:id="rIdLink10">
+        <w:r>
+          <w:rPr>
+            <w:color w:val="1155cc"/>
+            <w:u w:val="single"/>
+            <w:rtl w:val="0"/>
+          </w:rPr>
+          <w:t xml:space="preserve">https://doi.org/10.37652/juaps.2024.146489.1187</w:t>
+        </w:r>
+      </w:hyperlink>
+      <w:r>
+        <w:rPr>
+          <w:rtl w:val="0"/>
+        </w:rPr>
+        <w:t xml:space="preserve">.</w:t>
       </w:r>
     </w:p>
     <w:p>
@@ -8342,7 +8502,23 @@
         <w:rPr>
           <w:rtl w:val="0"/>
         </w:rPr>
-        <w:t xml:space="preserve">. Kaggle, [s.d.]. Disponível em: https://www.kaggle.com/datasets/imuhammad/course-reviews-on-coursera. Acesso em: 21 out. 2026.</w:t>
+        <w:t xml:space="preserve">. Kaggle, [s.d.]. Disponível em: </w:t>
+      </w:r>
+      <w:hyperlink r:id="rIdLink11">
+        <w:r>
+          <w:rPr>
+            <w:color w:val="1155cc"/>
+            <w:u w:val="single"/>
+            <w:rtl w:val="0"/>
+          </w:rPr>
+          <w:t xml:space="preserve">https://www.kaggle.com/datasets/imuhammad/course-reviews-on-coursera</w:t>
+        </w:r>
+      </w:hyperlink>
+      <w:r>
+        <w:rPr>
+          <w:rtl w:val="0"/>
+        </w:rPr>
+        <w:t xml:space="preserve">. Acesso em: 21 out. 2026.</w:t>
       </w:r>
     </w:p>
     <w:p>
@@ -8369,7 +8545,23 @@
         <w:rPr>
           <w:rtl w:val="0"/>
         </w:rPr>
-        <w:t xml:space="preserve">, v. 27, n. 6, p. 895-902, 2022. DOI: https://doi.org/10.18280/isi.270605.</w:t>
+        <w:t xml:space="preserve">, v. 27, n. 6, p. 895-902, 2022. DOI: </w:t>
+      </w:r>
+      <w:hyperlink r:id="rIdLink12">
+        <w:r>
+          <w:rPr>
+            <w:color w:val="1155cc"/>
+            <w:u w:val="single"/>
+            <w:rtl w:val="0"/>
+          </w:rPr>
+          <w:t xml:space="preserve">https://doi.org/10.18280/isi.270605</w:t>
+        </w:r>
+      </w:hyperlink>
+      <w:r>
+        <w:rPr>
+          <w:rtl w:val="0"/>
+        </w:rPr>
+        <w:t xml:space="preserve">.</w:t>
       </w:r>
     </w:p>
     <w:p>
@@ -8423,7 +8615,23 @@
         <w:rPr>
           <w:rtl w:val="0"/>
         </w:rPr>
-        <w:t xml:space="preserve">. Boston: Springer, 2011. p. 1-35. DOI: https://doi.org/10.1007/978-0-387-85820-3_1.</w:t>
+        <w:t xml:space="preserve">. Boston: Springer, 2011. p. 1-35. DOI: </w:t>
+      </w:r>
+      <w:hyperlink r:id="rIdLink13">
+        <w:r>
+          <w:rPr>
+            <w:color w:val="1155cc"/>
+            <w:u w:val="single"/>
+            <w:rtl w:val="0"/>
+          </w:rPr>
+          <w:t xml:space="preserve">https://doi.org/10.1007/978-0-387-85820-3_1</w:t>
+        </w:r>
+      </w:hyperlink>
+      <w:r>
+        <w:rPr>
+          <w:rtl w:val="0"/>
+        </w:rPr>
+        <w:t xml:space="preserve">.</w:t>
       </w:r>
     </w:p>
     <w:p>
@@ -8450,7 +8658,23 @@
         <w:rPr>
           <w:rtl w:val="0"/>
         </w:rPr>
-        <w:t xml:space="preserve">. 3. ed. New York: Springer, 2022. DOI: https://doi.org/10.1007/978-1-0716-2197-4.</w:t>
+        <w:t xml:space="preserve">. 3. ed. New York: Springer, 2022. DOI: </w:t>
+      </w:r>
+      <w:hyperlink r:id="rIdLink14">
+        <w:r>
+          <w:rPr>
+            <w:color w:val="1155cc"/>
+            <w:u w:val="single"/>
+            <w:rtl w:val="0"/>
+          </w:rPr>
+          <w:t xml:space="preserve">https://doi.org/10.1007/978-1-0716-2197-4</w:t>
+        </w:r>
+      </w:hyperlink>
+      <w:r>
+        <w:rPr>
+          <w:rtl w:val="0"/>
+        </w:rPr>
+        <w:t xml:space="preserve">.</w:t>
       </w:r>
     </w:p>
     <w:p>
@@ -8477,7 +8701,23 @@
         <w:rPr>
           <w:rtl w:val="0"/>
         </w:rPr>
-        <w:t xml:space="preserve">, v. 24, n. 5, p. 513-523, 1988. DOI: https://doi.org/10.1016/0306-4573(88)90021-0.</w:t>
+        <w:t xml:space="preserve">, v. 24, n. 5, p. 513-523, 1988. DOI: </w:t>
+      </w:r>
+      <w:hyperlink r:id="rIdLink15">
+        <w:r>
+          <w:rPr>
+            <w:color w:val="1155cc"/>
+            <w:u w:val="single"/>
+            <w:rtl w:val="0"/>
+          </w:rPr>
+          <w:t xml:space="preserve">https://doi.org/10.1016/0306-4573(88)90021-0</w:t>
+        </w:r>
+      </w:hyperlink>
+      <w:r>
+        <w:rPr>
+          <w:rtl w:val="0"/>
+        </w:rPr>
+        <w:t xml:space="preserve">.</w:t>
       </w:r>
     </w:p>
     <w:p>
@@ -8504,7 +8744,23 @@
         <w:rPr>
           <w:rtl w:val="0"/>
         </w:rPr>
-        <w:t xml:space="preserve"> [...]. New York: ACM, 2001. p. 285-295. DOI: https://doi.org/10.1145/371920.372071.</w:t>
+        <w:t xml:space="preserve"> [...]. New York: ACM, 2001. p. 285-295. DOI: </w:t>
+      </w:r>
+      <w:hyperlink r:id="rIdLink16">
+        <w:r>
+          <w:rPr>
+            <w:color w:val="1155cc"/>
+            <w:u w:val="single"/>
+            <w:rtl w:val="0"/>
+          </w:rPr>
+          <w:t xml:space="preserve">https://doi.org/10.1145/371920.372071</w:t>
+        </w:r>
+      </w:hyperlink>
+      <w:r>
+        <w:rPr>
+          <w:rtl w:val="0"/>
+        </w:rPr>
+        <w:t xml:space="preserve">.</w:t>
       </w:r>
     </w:p>
     <w:p>
@@ -8531,7 +8787,23 @@
         <w:rPr>
           <w:rtl w:val="0"/>
         </w:rPr>
-        <w:t xml:space="preserve">, v. 10, n. 14, 1611, 2021. DOI: https://doi.org/10.3390/electronics10141611.</w:t>
+        <w:t xml:space="preserve">, v. 10, n. 14, 1611, 2021. DOI: </w:t>
+      </w:r>
+      <w:hyperlink r:id="rIdLink17">
+        <w:r>
+          <w:rPr>
+            <w:color w:val="1155cc"/>
+            <w:u w:val="single"/>
+            <w:rtl w:val="0"/>
+          </w:rPr>
+          <w:t xml:space="preserve">https://doi.org/10.3390/electronics10141611</w:t>
+        </w:r>
+      </w:hyperlink>
+      <w:r>
+        <w:rPr>
+          <w:rtl w:val="0"/>
+        </w:rPr>
+        <w:t xml:space="preserve">.</w:t>
       </w:r>
     </w:p>
     <w:p>
@@ -8558,7 +8830,23 @@
         <w:rPr>
           <w:rtl w:val="0"/>
         </w:rPr>
-        <w:t xml:space="preserve">, v. 13, n. 9, 5548, 2023. DOI: https://doi.org/10.3390/app13095548.</w:t>
+        <w:t xml:space="preserve">, v. 13, n. 9, 5548, 2023. DOI: </w:t>
+      </w:r>
+      <w:hyperlink r:id="rIdLink18">
+        <w:r>
+          <w:rPr>
+            <w:color w:val="1155cc"/>
+            <w:u w:val="single"/>
+            <w:rtl w:val="0"/>
+          </w:rPr>
+          <w:t xml:space="preserve">https://doi.org/10.3390/app13095548</w:t>
+        </w:r>
+      </w:hyperlink>
+      <w:r>
+        <w:rPr>
+          <w:rtl w:val="0"/>
+        </w:rPr>
+        <w:t xml:space="preserve">.</w:t>
       </w:r>
     </w:p>
     <w:p>
@@ -8585,7 +8873,23 @@
         <w:rPr>
           <w:rtl w:val="0"/>
         </w:rPr>
-        <w:t xml:space="preserve">, v. 55, n. 8, p. 1-38, 2022. DOI: https://doi.org/10.1145/3556536.</w:t>
+        <w:t xml:space="preserve">, v. 55, n. 8, p. 1-38, 2022. DOI: </w:t>
+      </w:r>
+      <w:hyperlink r:id="rIdLink19">
+        <w:r>
+          <w:rPr>
+            <w:color w:val="1155cc"/>
+            <w:u w:val="single"/>
+            <w:rtl w:val="0"/>
+          </w:rPr>
+          <w:t xml:space="preserve">https://doi.org/10.1145/3556536</w:t>
+        </w:r>
+      </w:hyperlink>
+      <w:r>
+        <w:rPr>
+          <w:rtl w:val="0"/>
+        </w:rPr>
+        <w:t xml:space="preserve">.</w:t>
       </w:r>
     </w:p>
     <w:sectPr>

</xml_diff>